<commit_message>
Add same-payload parity case for manager_daily v5
</commit_message>
<xml_diff>
--- a/Ежедневный_отчет_Кешубаева_2026-04-06_v5.docx
+++ b/Ежедневный_отчет_Кешубаева_2026-04-06_v5.docx
@@ -49,7 +49,7 @@
           <w:sz w:val="24"/>
           <w:szCs w:val="24"/>
         </w:rPr>
-        <w:t xml:space="preserve">06.04.2026  ·  8 звонков</w:t>
+        <w:t xml:space="preserve">2026-04-06  ·  8 звонков</w:t>
       </w:r>
     </w:p>
     <w:p>
@@ -508,7 +508,7 @@
           <w:sz w:val="22"/>
           <w:szCs w:val="22"/>
         </w:rPr>
-        <w:t xml:space="preserve">6 повторных/тёплых звонков сегодня (Тёплый/заявка × 3, Горячий/Входящий × 3)</w:t>
+        <w:t xml:space="preserve">Тёплые и горячие лиды в текущем срезе не выделены.</w:t>
       </w:r>
     </w:p>
     <w:p>
@@ -524,7 +524,7 @@
           <w:sz w:val="22"/>
           <w:szCs w:val="22"/>
         </w:rPr>
-        <w:t xml:space="preserve">4 → Договорились  ·  0 → Перенос  ·  1 → Отказ  ·  1 → Открыт</w:t>
+        <w:t xml:space="preserve">0 → Договорились · 0 → Перенос · 0 → Отказ · 0 → Открыт</w:t>
       </w:r>
     </w:p>
     <w:p>
@@ -540,7 +540,7 @@
           <w:sz w:val="22"/>
           <w:szCs w:val="22"/>
         </w:rPr>
-        <w:t xml:space="preserve">Конверсия тёплых: 67% (4 из 6)</w:t>
+        <w:t xml:space="preserve">Конверсия тёплых: нет базы для расчёта.</w:t>
       </w:r>
     </w:p>
     <w:p>
@@ -556,7 +556,7 @@
           <w:sz w:val="22"/>
           <w:szCs w:val="22"/>
         </w:rPr>
-        <w:t xml:space="preserve">Среднее: нет базы для сравнения (первый период).</w:t>
+        <w:t xml:space="preserve">Среднее: нет базы для сравнения.</w:t>
       </w:r>
     </w:p>
     <w:p>
@@ -717,116 +717,6 @@
                 <w:szCs w:val="18"/>
               </w:rPr>
               <w:t xml:space="preserve">Статус</w:t>
-            </w:r>
-          </w:p>
-        </w:tc>
-      </w:tr>
-      <w:tr>
-        <w:tc>
-          <w:tcPr>
-            <w:tcBorders>
-              <w:top w:val="single" w:color="CCCCCC" w:sz="4"/>
-              <w:left w:val="single" w:color="CCCCCC" w:sz="4"/>
-              <w:bottom w:val="single" w:color="CCCCCC" w:sz="4"/>
-              <w:right w:val="single" w:color="CCCCCC" w:sz="4"/>
-            </w:tcBorders>
-            <w:tcMar>
-              <w:top w:type="dxa" w:w="60"/>
-              <w:left w:type="dxa" w:w="80"/>
-              <w:bottom w:type="dxa" w:w="60"/>
-              <w:right w:type="dxa" w:w="80"/>
-            </w:tcMar>
-            <w:vAlign w:val="center"/>
-          </w:tcPr>
-          <w:p>
-            <w:pPr>
-              <w:spacing w:after="0" w:before="0"/>
-              <w:jc w:val="left"/>
-            </w:pPr>
-            <w:r>
-              <w:rPr>
-                <w:rFonts w:ascii="Arial" w:cs="Arial" w:eastAsia="Arial" w:hAnsi="Arial"/>
-                <w:b w:val="false"/>
-                <w:bCs w:val="false"/>
-                <w:i w:val="false"/>
-                <w:iCs w:val="false"/>
-                <w:color w:val="000000"/>
-                <w:sz w:val="22"/>
-                <w:szCs w:val="22"/>
-              </w:rPr>
-              <w:t xml:space="preserve">Сергей Иванов</w:t>
-            </w:r>
-          </w:p>
-        </w:tc>
-        <w:tc>
-          <w:tcPr>
-            <w:tcBorders>
-              <w:top w:val="single" w:color="CCCCCC" w:sz="4"/>
-              <w:left w:val="single" w:color="CCCCCC" w:sz="4"/>
-              <w:bottom w:val="single" w:color="CCCCCC" w:sz="4"/>
-              <w:right w:val="single" w:color="CCCCCC" w:sz="4"/>
-            </w:tcBorders>
-            <w:tcMar>
-              <w:top w:type="dxa" w:w="60"/>
-              <w:left w:type="dxa" w:w="80"/>
-              <w:bottom w:type="dxa" w:w="60"/>
-              <w:right w:type="dxa" w:w="80"/>
-            </w:tcMar>
-            <w:vAlign w:val="center"/>
-          </w:tcPr>
-          <w:p>
-            <w:pPr>
-              <w:spacing w:after="0" w:before="0"/>
-              <w:jc w:val="left"/>
-            </w:pPr>
-            <w:r>
-              <w:rPr>
-                <w:rFonts w:ascii="Arial" w:cs="Arial" w:eastAsia="Arial" w:hAnsi="Arial"/>
-                <w:b w:val="false"/>
-                <w:bCs w:val="false"/>
-                <w:i w:val="false"/>
-                <w:iCs w:val="false"/>
-                <w:color w:val="000000"/>
-                <w:sz w:val="22"/>
-                <w:szCs w:val="22"/>
-              </w:rPr>
-              <w:t xml:space="preserve">+7 701 999-6007</w:t>
-            </w:r>
-          </w:p>
-        </w:tc>
-        <w:tc>
-          <w:tcPr>
-            <w:tcBorders>
-              <w:top w:val="single" w:color="CCCCCC" w:sz="4"/>
-              <w:left w:val="single" w:color="CCCCCC" w:sz="4"/>
-              <w:bottom w:val="single" w:color="CCCCCC" w:sz="4"/>
-              <w:right w:val="single" w:color="CCCCCC" w:sz="4"/>
-            </w:tcBorders>
-            <w:tcMar>
-              <w:top w:type="dxa" w:w="60"/>
-              <w:left w:type="dxa" w:w="80"/>
-              <w:bottom w:type="dxa" w:w="60"/>
-              <w:right w:type="dxa" w:w="80"/>
-            </w:tcMar>
-            <w:vAlign w:val="center"/>
-          </w:tcPr>
-          <w:p>
-            <w:pPr>
-              <w:spacing w:after="0" w:before="0"/>
-              <w:jc w:val="left"/>
-            </w:pPr>
-            <w:r>
-              <w:rPr>
-                <w:rFonts w:ascii="Arial" w:cs="Arial" w:eastAsia="Arial" w:hAnsi="Arial"/>
-                <w:b w:val="false"/>
-                <w:bCs w:val="false"/>
-                <w:i w:val="false"/>
-                <w:iCs w:val="false"/>
-                <w:color w:val="E87722"/>
-                <w:sz w:val="22"/>
-                <w:szCs w:val="22"/>
-              </w:rPr>
-              <w:t xml:space="preserve">Открытый — ждёт одобрения руководства</w:t>
             </w:r>
           </w:p>
         </w:tc>
@@ -1287,7 +1177,7 @@
                 <w:sz w:val="22"/>
                 <w:szCs w:val="22"/>
               </w:rPr>
-              <w:t xml:space="preserve">Э2 Квалификация и потребность</w:t>
+              <w:t xml:space="preserve">Э2 Квалификация и первичная потребность</w:t>
             </w:r>
           </w:p>
         </w:tc>
@@ -1507,7 +1397,7 @@
                 <w:sz w:val="22"/>
                 <w:szCs w:val="22"/>
               </w:rPr>
-              <w:t xml:space="preserve">1.0</w:t>
+              <w:t xml:space="preserve">0.9</w:t>
             </w:r>
           </w:p>
         </w:tc>
@@ -2196,13 +2086,13 @@
                 <w:rFonts w:ascii="Arial" w:cs="Arial" w:eastAsia="Arial" w:hAnsi="Arial"/>
                 <w:b w:val="false"/>
                 <w:bCs w:val="false"/>
-                <w:i w:val="false"/>
-                <w:iCs w:val="false"/>
-                <w:color w:val="000000"/>
-                <w:sz w:val="22"/>
-                <w:szCs w:val="22"/>
-              </w:rPr>
-              <w:t xml:space="preserve">Э4 Формирование предложения</w:t>
+                <w:i/>
+                <w:iCs/>
+                <w:color w:val="E87722"/>
+                <w:sz w:val="22"/>
+                <w:szCs w:val="22"/>
+              </w:rPr>
+              <w:t xml:space="preserve">↳ Понял контекст решения</w:t>
             </w:r>
           </w:p>
         </w:tc>
@@ -2234,11 +2124,11 @@
                 <w:bCs w:val="false"/>
                 <w:i w:val="false"/>
                 <w:iCs w:val="false"/>
-                <w:color w:val="000000"/>
-                <w:sz w:val="22"/>
-                <w:szCs w:val="22"/>
-              </w:rPr>
-              <w:t xml:space="preserve">2.6</w:t>
+                <w:color w:val="E87722"/>
+                <w:sz w:val="22"/>
+                <w:szCs w:val="22"/>
+              </w:rPr>
+              <w:t xml:space="preserve">1.9</w:t>
             </w:r>
           </w:p>
         </w:tc>
@@ -2310,43 +2200,43 @@
                 <w:sz w:val="20"/>
                 <w:szCs w:val="20"/>
               </w:rPr>
-              <w:t xml:space="preserve">██████████░░░░░░░░░░</w:t>
-            </w:r>
-          </w:p>
-        </w:tc>
-        <w:tc>
-          <w:tcPr>
-            <w:tcBorders>
-              <w:top w:val="single" w:color="CCCCCC" w:sz="4"/>
-              <w:left w:val="single" w:color="CCCCCC" w:sz="4"/>
-              <w:bottom w:val="single" w:color="CCCCCC" w:sz="4"/>
-              <w:right w:val="single" w:color="CCCCCC" w:sz="4"/>
-            </w:tcBorders>
-            <w:tcMar>
-              <w:top w:type="dxa" w:w="60"/>
-              <w:left w:type="dxa" w:w="80"/>
-              <w:bottom w:type="dxa" w:w="60"/>
-              <w:right w:type="dxa" w:w="80"/>
-            </w:tcMar>
-            <w:vAlign w:val="center"/>
-          </w:tcPr>
-          <w:p>
-            <w:pPr>
-              <w:spacing w:after="0" w:before="0"/>
-              <w:jc w:val="center"/>
-            </w:pPr>
-            <w:r>
-              <w:rPr>
-                <w:rFonts w:ascii="Arial" w:cs="Arial" w:eastAsia="Arial" w:hAnsi="Arial"/>
-                <w:b/>
-                <w:bCs/>
-                <w:i w:val="false"/>
-                <w:iCs w:val="false"/>
-                <w:color w:val="2E8B57"/>
-                <w:sz w:val="22"/>
-                <w:szCs w:val="22"/>
-              </w:rPr>
-              <w:t xml:space="preserve">—</w:t>
+              <w:t xml:space="preserve">████████░░░░░░░░░░░░</w:t>
+            </w:r>
+          </w:p>
+        </w:tc>
+        <w:tc>
+          <w:tcPr>
+            <w:tcBorders>
+              <w:top w:val="single" w:color="CCCCCC" w:sz="4"/>
+              <w:left w:val="single" w:color="CCCCCC" w:sz="4"/>
+              <w:bottom w:val="single" w:color="CCCCCC" w:sz="4"/>
+              <w:right w:val="single" w:color="CCCCCC" w:sz="4"/>
+            </w:tcBorders>
+            <w:tcMar>
+              <w:top w:type="dxa" w:w="60"/>
+              <w:left w:type="dxa" w:w="80"/>
+              <w:bottom w:type="dxa" w:w="60"/>
+              <w:right w:type="dxa" w:w="80"/>
+            </w:tcMar>
+            <w:vAlign w:val="center"/>
+          </w:tcPr>
+          <w:p>
+            <w:pPr>
+              <w:spacing w:after="0" w:before="0"/>
+              <w:jc w:val="left"/>
+            </w:pPr>
+            <w:r>
+              <w:rPr>
+                <w:rFonts w:ascii="Arial" w:cs="Arial" w:eastAsia="Arial" w:hAnsi="Arial"/>
+                <w:b w:val="false"/>
+                <w:bCs w:val="false"/>
+                <w:i w:val="false"/>
+                <w:iCs w:val="false"/>
+                <w:color w:val="000000"/>
+                <w:sz w:val="22"/>
+                <w:szCs w:val="22"/>
+              </w:rPr>
+              <w:t xml:space="preserve"/>
             </w:r>
           </w:p>
         </w:tc>
@@ -2384,7 +2274,7 @@
                 <w:sz w:val="22"/>
                 <w:szCs w:val="22"/>
               </w:rPr>
-              <w:t xml:space="preserve">Э5 Работа с возражениями</w:t>
+              <w:t xml:space="preserve">Э4 Формирование предложения</w:t>
             </w:r>
           </w:p>
         </w:tc>
@@ -2420,7 +2310,7 @@
                 <w:sz w:val="22"/>
                 <w:szCs w:val="22"/>
               </w:rPr>
-              <w:t xml:space="preserve">—</w:t>
+              <w:t xml:space="preserve">2.6</w:t>
             </w:r>
           </w:p>
         </w:tc>
@@ -2492,371 +2382,7 @@
                 <w:sz w:val="20"/>
                 <w:szCs w:val="20"/>
               </w:rPr>
-              <w:t xml:space="preserve">—</w:t>
-            </w:r>
-          </w:p>
-        </w:tc>
-        <w:tc>
-          <w:tcPr>
-            <w:tcBorders>
-              <w:top w:val="single" w:color="CCCCCC" w:sz="4"/>
-              <w:left w:val="single" w:color="CCCCCC" w:sz="4"/>
-              <w:bottom w:val="single" w:color="CCCCCC" w:sz="4"/>
-              <w:right w:val="single" w:color="CCCCCC" w:sz="4"/>
-            </w:tcBorders>
-            <w:tcMar>
-              <w:top w:type="dxa" w:w="60"/>
-              <w:left w:type="dxa" w:w="80"/>
-              <w:bottom w:type="dxa" w:w="60"/>
-              <w:right w:type="dxa" w:w="80"/>
-            </w:tcMar>
-            <w:vAlign w:val="center"/>
-          </w:tcPr>
-          <w:p>
-            <w:pPr>
-              <w:spacing w:after="0" w:before="0"/>
-              <w:jc w:val="center"/>
-            </w:pPr>
-            <w:r>
-              <w:rPr>
-                <w:rFonts w:ascii="Arial" w:cs="Arial" w:eastAsia="Arial" w:hAnsi="Arial"/>
-                <w:b/>
-                <w:bCs/>
-                <w:i w:val="false"/>
-                <w:iCs w:val="false"/>
-                <w:color w:val="2E8B57"/>
-                <w:sz w:val="22"/>
-                <w:szCs w:val="22"/>
-              </w:rPr>
-              <w:t xml:space="preserve">—</w:t>
-            </w:r>
-          </w:p>
-        </w:tc>
-      </w:tr>
-      <w:tr>
-        <w:tc>
-          <w:tcPr>
-            <w:tcBorders>
-              <w:top w:val="single" w:color="CCCCCC" w:sz="4"/>
-              <w:left w:val="single" w:color="CCCCCC" w:sz="4"/>
-              <w:bottom w:val="single" w:color="CCCCCC" w:sz="4"/>
-              <w:right w:val="single" w:color="CCCCCC" w:sz="4"/>
-            </w:tcBorders>
-            <w:tcMar>
-              <w:top w:type="dxa" w:w="60"/>
-              <w:left w:type="dxa" w:w="80"/>
-              <w:bottom w:type="dxa" w:w="60"/>
-              <w:right w:type="dxa" w:w="80"/>
-            </w:tcMar>
-            <w:vAlign w:val="center"/>
-          </w:tcPr>
-          <w:p>
-            <w:pPr>
-              <w:spacing w:after="0" w:before="0"/>
-              <w:jc w:val="left"/>
-            </w:pPr>
-            <w:r>
-              <w:rPr>
-                <w:rFonts w:ascii="Arial" w:cs="Arial" w:eastAsia="Arial" w:hAnsi="Arial"/>
-                <w:b w:val="false"/>
-                <w:bCs w:val="false"/>
-                <w:i w:val="false"/>
-                <w:iCs w:val="false"/>
-                <w:color w:val="000000"/>
-                <w:sz w:val="22"/>
-                <w:szCs w:val="22"/>
-              </w:rPr>
-              <w:t xml:space="preserve">Э6 Завершение и следующий шаг</w:t>
-            </w:r>
-          </w:p>
-        </w:tc>
-        <w:tc>
-          <w:tcPr>
-            <w:tcBorders>
-              <w:top w:val="single" w:color="CCCCCC" w:sz="4"/>
-              <w:left w:val="single" w:color="CCCCCC" w:sz="4"/>
-              <w:bottom w:val="single" w:color="CCCCCC" w:sz="4"/>
-              <w:right w:val="single" w:color="CCCCCC" w:sz="4"/>
-            </w:tcBorders>
-            <w:tcMar>
-              <w:top w:type="dxa" w:w="60"/>
-              <w:left w:type="dxa" w:w="80"/>
-              <w:bottom w:type="dxa" w:w="60"/>
-              <w:right w:type="dxa" w:w="80"/>
-            </w:tcMar>
-            <w:vAlign w:val="center"/>
-          </w:tcPr>
-          <w:p>
-            <w:pPr>
-              <w:spacing w:after="0" w:before="0"/>
-              <w:jc w:val="center"/>
-            </w:pPr>
-            <w:r>
-              <w:rPr>
-                <w:rFonts w:ascii="Arial" w:cs="Arial" w:eastAsia="Arial" w:hAnsi="Arial"/>
-                <w:b w:val="false"/>
-                <w:bCs w:val="false"/>
-                <w:i w:val="false"/>
-                <w:iCs w:val="false"/>
-                <w:color w:val="000000"/>
-                <w:sz w:val="22"/>
-                <w:szCs w:val="22"/>
-              </w:rPr>
-              <w:t xml:space="preserve">—</w:t>
-            </w:r>
-          </w:p>
-        </w:tc>
-        <w:tc>
-          <w:tcPr>
-            <w:tcBorders>
-              <w:top w:val="single" w:color="CCCCCC" w:sz="4"/>
-              <w:left w:val="single" w:color="CCCCCC" w:sz="4"/>
-              <w:bottom w:val="single" w:color="CCCCCC" w:sz="4"/>
-              <w:right w:val="single" w:color="CCCCCC" w:sz="4"/>
-            </w:tcBorders>
-            <w:tcMar>
-              <w:top w:type="dxa" w:w="60"/>
-              <w:left w:type="dxa" w:w="80"/>
-              <w:bottom w:type="dxa" w:w="60"/>
-              <w:right w:type="dxa" w:w="80"/>
-            </w:tcMar>
-            <w:vAlign w:val="center"/>
-          </w:tcPr>
-          <w:p>
-            <w:pPr>
-              <w:spacing w:after="0" w:before="0"/>
-              <w:jc w:val="center"/>
-            </w:pPr>
-            <w:r>
-              <w:rPr>
-                <w:rFonts w:ascii="Arial" w:cs="Arial" w:eastAsia="Arial" w:hAnsi="Arial"/>
-                <w:b w:val="false"/>
-                <w:bCs w:val="false"/>
-                <w:i w:val="false"/>
-                <w:iCs w:val="false"/>
-                <w:color w:val="888888"/>
-                <w:sz w:val="22"/>
-                <w:szCs w:val="22"/>
-              </w:rPr>
-              <w:t xml:space="preserve">—</w:t>
-            </w:r>
-          </w:p>
-        </w:tc>
-        <w:tc>
-          <w:tcPr>
-            <w:tcBorders>
-              <w:top w:val="single" w:color="CCCCCC" w:sz="4"/>
-              <w:left w:val="single" w:color="CCCCCC" w:sz="4"/>
-              <w:bottom w:val="single" w:color="CCCCCC" w:sz="4"/>
-              <w:right w:val="single" w:color="CCCCCC" w:sz="4"/>
-            </w:tcBorders>
-            <w:tcMar>
-              <w:top w:type="dxa" w:w="60"/>
-              <w:left w:type="dxa" w:w="80"/>
-              <w:bottom w:type="dxa" w:w="60"/>
-              <w:right w:type="dxa" w:w="80"/>
-            </w:tcMar>
-            <w:vAlign w:val="center"/>
-          </w:tcPr>
-          <w:p>
-            <w:pPr>
-              <w:spacing w:after="0" w:before="0"/>
-              <w:jc w:val="left"/>
-            </w:pPr>
-            <w:r>
-              <w:rPr>
-                <w:rFonts w:ascii="Arial" w:cs="Arial" w:eastAsia="Arial" w:hAnsi="Arial"/>
-                <w:b w:val="false"/>
-                <w:bCs w:val="false"/>
-                <w:i w:val="false"/>
-                <w:iCs w:val="false"/>
-                <w:color w:val="000000"/>
-                <w:sz w:val="20"/>
-                <w:szCs w:val="20"/>
-              </w:rPr>
-              <w:t xml:space="preserve">—</w:t>
-            </w:r>
-          </w:p>
-        </w:tc>
-        <w:tc>
-          <w:tcPr>
-            <w:tcBorders>
-              <w:top w:val="single" w:color="CCCCCC" w:sz="4"/>
-              <w:left w:val="single" w:color="CCCCCC" w:sz="4"/>
-              <w:bottom w:val="single" w:color="CCCCCC" w:sz="4"/>
-              <w:right w:val="single" w:color="CCCCCC" w:sz="4"/>
-            </w:tcBorders>
-            <w:tcMar>
-              <w:top w:type="dxa" w:w="60"/>
-              <w:left w:type="dxa" w:w="80"/>
-              <w:bottom w:type="dxa" w:w="60"/>
-              <w:right w:type="dxa" w:w="80"/>
-            </w:tcMar>
-            <w:vAlign w:val="center"/>
-          </w:tcPr>
-          <w:p>
-            <w:pPr>
-              <w:spacing w:after="0" w:before="0"/>
-              <w:jc w:val="center"/>
-            </w:pPr>
-            <w:r>
-              <w:rPr>
-                <w:rFonts w:ascii="Arial" w:cs="Arial" w:eastAsia="Arial" w:hAnsi="Arial"/>
-                <w:b/>
-                <w:bCs/>
-                <w:i w:val="false"/>
-                <w:iCs w:val="false"/>
-                <w:color w:val="2E8B57"/>
-                <w:sz w:val="22"/>
-                <w:szCs w:val="22"/>
-              </w:rPr>
-              <w:t xml:space="preserve">—</w:t>
-            </w:r>
-          </w:p>
-        </w:tc>
-      </w:tr>
-      <w:tr>
-        <w:tc>
-          <w:tcPr>
-            <w:tcBorders>
-              <w:top w:val="single" w:color="CCCCCC" w:sz="4"/>
-              <w:left w:val="single" w:color="CCCCCC" w:sz="4"/>
-              <w:bottom w:val="single" w:color="CCCCCC" w:sz="4"/>
-              <w:right w:val="single" w:color="CCCCCC" w:sz="4"/>
-            </w:tcBorders>
-            <w:tcMar>
-              <w:top w:type="dxa" w:w="60"/>
-              <w:left w:type="dxa" w:w="80"/>
-              <w:bottom w:type="dxa" w:w="60"/>
-              <w:right w:type="dxa" w:w="80"/>
-            </w:tcMar>
-            <w:vAlign w:val="center"/>
-          </w:tcPr>
-          <w:p>
-            <w:pPr>
-              <w:spacing w:after="0" w:before="0"/>
-              <w:jc w:val="left"/>
-            </w:pPr>
-            <w:r>
-              <w:rPr>
-                <w:rFonts w:ascii="Arial" w:cs="Arial" w:eastAsia="Arial" w:hAnsi="Arial"/>
-                <w:b w:val="false"/>
-                <w:bCs w:val="false"/>
-                <w:i w:val="false"/>
-                <w:iCs w:val="false"/>
-                <w:color w:val="000000"/>
-                <w:sz w:val="22"/>
-                <w:szCs w:val="22"/>
-              </w:rPr>
-              <w:t xml:space="preserve">Сквозной критерий</w:t>
-            </w:r>
-          </w:p>
-        </w:tc>
-        <w:tc>
-          <w:tcPr>
-            <w:tcBorders>
-              <w:top w:val="single" w:color="CCCCCC" w:sz="4"/>
-              <w:left w:val="single" w:color="CCCCCC" w:sz="4"/>
-              <w:bottom w:val="single" w:color="CCCCCC" w:sz="4"/>
-              <w:right w:val="single" w:color="CCCCCC" w:sz="4"/>
-            </w:tcBorders>
-            <w:tcMar>
-              <w:top w:type="dxa" w:w="60"/>
-              <w:left w:type="dxa" w:w="80"/>
-              <w:bottom w:type="dxa" w:w="60"/>
-              <w:right w:type="dxa" w:w="80"/>
-            </w:tcMar>
-            <w:vAlign w:val="center"/>
-          </w:tcPr>
-          <w:p>
-            <w:pPr>
-              <w:spacing w:after="0" w:before="0"/>
-              <w:jc w:val="center"/>
-            </w:pPr>
-            <w:r>
-              <w:rPr>
-                <w:rFonts w:ascii="Arial" w:cs="Arial" w:eastAsia="Arial" w:hAnsi="Arial"/>
-                <w:b w:val="false"/>
-                <w:bCs w:val="false"/>
-                <w:i w:val="false"/>
-                <w:iCs w:val="false"/>
-                <w:color w:val="000000"/>
-                <w:sz w:val="22"/>
-                <w:szCs w:val="22"/>
-              </w:rPr>
-              <w:t xml:space="preserve">—</w:t>
-            </w:r>
-          </w:p>
-        </w:tc>
-        <w:tc>
-          <w:tcPr>
-            <w:tcBorders>
-              <w:top w:val="single" w:color="CCCCCC" w:sz="4"/>
-              <w:left w:val="single" w:color="CCCCCC" w:sz="4"/>
-              <w:bottom w:val="single" w:color="CCCCCC" w:sz="4"/>
-              <w:right w:val="single" w:color="CCCCCC" w:sz="4"/>
-            </w:tcBorders>
-            <w:tcMar>
-              <w:top w:type="dxa" w:w="60"/>
-              <w:left w:type="dxa" w:w="80"/>
-              <w:bottom w:type="dxa" w:w="60"/>
-              <w:right w:type="dxa" w:w="80"/>
-            </w:tcMar>
-            <w:vAlign w:val="center"/>
-          </w:tcPr>
-          <w:p>
-            <w:pPr>
-              <w:spacing w:after="0" w:before="0"/>
-              <w:jc w:val="center"/>
-            </w:pPr>
-            <w:r>
-              <w:rPr>
-                <w:rFonts w:ascii="Arial" w:cs="Arial" w:eastAsia="Arial" w:hAnsi="Arial"/>
-                <w:b w:val="false"/>
-                <w:bCs w:val="false"/>
-                <w:i w:val="false"/>
-                <w:iCs w:val="false"/>
-                <w:color w:val="888888"/>
-                <w:sz w:val="22"/>
-                <w:szCs w:val="22"/>
-              </w:rPr>
-              <w:t xml:space="preserve">—</w:t>
-            </w:r>
-          </w:p>
-        </w:tc>
-        <w:tc>
-          <w:tcPr>
-            <w:tcBorders>
-              <w:top w:val="single" w:color="CCCCCC" w:sz="4"/>
-              <w:left w:val="single" w:color="CCCCCC" w:sz="4"/>
-              <w:bottom w:val="single" w:color="CCCCCC" w:sz="4"/>
-              <w:right w:val="single" w:color="CCCCCC" w:sz="4"/>
-            </w:tcBorders>
-            <w:tcMar>
-              <w:top w:type="dxa" w:w="60"/>
-              <w:left w:type="dxa" w:w="80"/>
-              <w:bottom w:type="dxa" w:w="60"/>
-              <w:right w:type="dxa" w:w="80"/>
-            </w:tcMar>
-            <w:vAlign w:val="center"/>
-          </w:tcPr>
-          <w:p>
-            <w:pPr>
-              <w:spacing w:after="0" w:before="0"/>
-              <w:jc w:val="left"/>
-            </w:pPr>
-            <w:r>
-              <w:rPr>
-                <w:rFonts w:ascii="Arial" w:cs="Arial" w:eastAsia="Arial" w:hAnsi="Arial"/>
-                <w:b w:val="false"/>
-                <w:bCs w:val="false"/>
-                <w:i w:val="false"/>
-                <w:iCs w:val="false"/>
-                <w:color w:val="000000"/>
-                <w:sz w:val="20"/>
-                <w:szCs w:val="20"/>
-              </w:rPr>
-              <w:t xml:space="preserve">—</w:t>
+              <w:t xml:space="preserve">██████████░░░░░░░░░░</w:t>
             </w:r>
           </w:p>
         </w:tc>
@@ -2956,7 +2482,7 @@
           <w:sz w:val="24"/>
           <w:szCs w:val="24"/>
         </w:rPr>
-        <w:t xml:space="preserve">Э3 Выявление детальных потребностей (1.0 / 5) — первый этап ниже 4 по воронке</w:t>
+        <w:t xml:space="preserve">СИТУАЦИЯ ДНЯ · Выявление детальных потребностей (1.9) — первый этап ниже 4 по воронке</w:t>
       </w:r>
     </w:p>
     <w:p>
@@ -2972,7 +2498,23 @@
           <w:sz w:val="22"/>
           <w:szCs w:val="22"/>
         </w:rPr>
-        <w:t xml:space="preserve">«Менеджер переходит к презентации, не задав вопросов о потребностях» — 7 из 8 звонков · конверсия по этим звонкам: 43%</w:t>
+        <w:t xml:space="preserve">Клиент не чувствует, что решение подобрано под его задачу. Повторяемость: 7 звонк(ов). Пример: Менеджер перешёл к презентации продукта, не задав ни одного вопроса о текущем документообороте, объёме контрагентов или болевых точках.</w:t>
+      </w:r>
+    </w:p>
+    <w:p>
+      <w:pPr>
+        <w:spacing w:after="60" w:before="0"/>
+      </w:pPr>
+      <w:r>
+        <w:rPr>
+          <w:rFonts w:ascii="Arial" w:cs="Arial" w:eastAsia="Arial" w:hAnsi="Arial"/>
+          <w:b w:val="false"/>
+          <w:bCs w:val="false"/>
+          <w:color w:val="888888"/>
+          <w:sz w:val="22"/>
+          <w:szCs w:val="22"/>
+        </w:rPr>
+        <w:t xml:space="preserve">Паттерн повторился в 7 из 8 звонков</w:t>
       </w:r>
     </w:p>
     <w:p>
@@ -3017,7 +2559,7 @@
           <w:sz w:val="22"/>
           <w:szCs w:val="22"/>
         </w:rPr>
-        <w:t xml:space="preserve">Клиент звонил не слушать скрипт, а получить ощущение, что ему предлагают решение под его задачу. Когда вопросов о процессе нет — клиент слышит «стандартную презентацию» и начинает сравнивать по цене, а не по ценности.</w:t>
+        <w:t xml:space="preserve">Клиент хотел услышать решение под свою конкретную задачу, а не общую презентацию. Клиент не чувствует, что решение подобрано под его задачу. Повторяемость: 7 звонк(ов). Пример: Менеджер перешёл к презентации продукта, не задав ни одного вопроса о текущем документообороте, объёме контрагентов или болевых точках.</w:t>
       </w:r>
     </w:p>
     <w:p>
@@ -3062,7 +2604,7 @@
           <w:sz w:val="22"/>
           <w:szCs w:val="22"/>
         </w:rPr>
-        <w:t xml:space="preserve">Задать 2–3 уточняющих вопроса о процессе клиента ДО начала презентации в каждом звонке.</w:t>
+        <w:t xml:space="preserve">Поднять этап 'Выявление детальных потребностей' до 4.0+ и до презентации фиксировать 2–3 уточняющих вопроса.</w:t>
       </w:r>
     </w:p>
     <w:p>
@@ -3107,7 +2649,7 @@
           <w:sz w:val="22"/>
           <w:szCs w:val="22"/>
         </w:rPr>
-        <w:t xml:space="preserve">Звонок 10:30 — Анна Сидорова. Менеджер перешла к презентации через 45 секунд, не спросив ни об объёме, ни о контрагентах — клиент завершила разговор без обязательства.</w:t>
+        <w:t xml:space="preserve">Звонок 10:30 — Анна Сидорова. Менеджер перешёл к презентации продукта, не задав ни одного вопроса о текущем до…</w:t>
       </w:r>
     </w:p>
     <w:p>
@@ -3152,7 +2694,7 @@
           <w:sz w:val="22"/>
           <w:szCs w:val="22"/>
         </w:rPr>
-        <w:t xml:space="preserve">1. «Расскажите, как у вас сейчас организован процесс подписания документов? Какие типы контрагентов вам важно закрыть в первую очередь?»</w:t>
+        <w:t xml:space="preserve">1. Расскажите, как у вас сейчас организован процесс подписания документов? Какие типы контрагентов вам важно закрыть в первую очередь?</w:t>
       </w:r>
     </w:p>
     <w:p>
@@ -3168,7 +2710,7 @@
           <w:sz w:val="22"/>
           <w:szCs w:val="22"/>
         </w:rPr>
-        <w:t xml:space="preserve">2. «Удобно ли вам сейчас пару минут уделить — я расскажу, почему звоню?» → затем сразу вопрос о процессе.</w:t>
+        <w:t xml:space="preserve">2. Удобно ли вам сейчас пару минут уделить — я расскажу, почему звоню?</w:t>
       </w:r>
     </w:p>
     <w:p>
@@ -3184,7 +2726,7 @@
           <w:sz w:val="22"/>
           <w:szCs w:val="22"/>
         </w:rPr>
-        <w:t xml:space="preserve">3. «Два быстрых вопроса: сколько договоров в месяц и с кем в основном подписываете? Потом за 2 минуты покажу, где конкретно экономия.»</w:t>
+        <w:t xml:space="preserve">3. Итак, договариваемся: я пришлю договор до конца дня, вы ознакомитесь до пятницы — в пятницу созвонимся и подтвердим. Удобно?</w:t>
       </w:r>
     </w:p>
     <w:p>
@@ -3229,7 +2771,7 @@
           <w:sz w:val="22"/>
           <w:szCs w:val="22"/>
         </w:rPr>
-        <w:t xml:space="preserve">Вопросы о процессе создают контекст, в котором предложение звучит как решение конкретной задачи клиента, а не как шаблонная презентация. Клиент, который сам описал свою боль, легче соглашается с тем, что это боль — и что у вас есть ответ.</w:t>
+        <w:t xml:space="preserve">Помогает сделать следующий шаг понятным и управляемым.</w:t>
       </w:r>
     </w:p>
     <w:p>
@@ -4068,7 +3610,7 @@
                 <w:sz w:val="20"/>
                 <w:szCs w:val="20"/>
               </w:rPr>
-              <w:t xml:space="preserve">Алексей Морозов, 03:15, Тёплый лид</w:t>
+              <w:t xml:space="preserve">Алексей Морозов · 09:15</w:t>
             </w:r>
           </w:p>
         </w:tc>
@@ -4179,7 +3721,7 @@
                 <w:sz w:val="20"/>
                 <w:szCs w:val="20"/>
               </w:rPr>
-              <w:t xml:space="preserve">Анна Сидорова, 04:30, Холодный</w:t>
+              <w:t xml:space="preserve">Анна Сидорова · 10:30</w:t>
             </w:r>
           </w:p>
         </w:tc>
@@ -4291,7 +3833,7 @@
                 <w:sz w:val="20"/>
                 <w:szCs w:val="20"/>
               </w:rPr>
-              <w:t xml:space="preserve">+77019876543, 05:00, Входящий</w:t>
+              <w:t xml:space="preserve">+77019876543 · 11:00</w:t>
             </w:r>
           </w:p>
         </w:tc>
@@ -5541,7 +5083,7 @@
           <w:sz w:val="24"/>
           <w:szCs w:val="24"/>
         </w:rPr>
-        <w:t xml:space="preserve">Из следующих 8 продажных звонков — задай минимум 2 уточняющих вопроса о потребностях ДО начала презентации хотя бы в 6 из 8.</w:t>
+        <w:t xml:space="preserve">Из следующих 8 звонков — отработать 'Выявление детальных потребностей' минимум в 6 случаях.</w:t>
       </w:r>
     </w:p>
     <w:p>
@@ -5570,7 +5112,7 @@
           <w:sz w:val="22"/>
           <w:szCs w:val="22"/>
         </w:rPr>
-        <w:t xml:space="preserve">Сегодня: 1 из 8 звонков с уточняющими вопросами.</w:t>
+        <w:t xml:space="preserve">Сегодня: 7 звонк(ов) с повторением основного паттерна дня.</w:t>
       </w:r>
     </w:p>
     <w:p>
@@ -5631,7 +5173,7 @@
           <w:sz w:val="22"/>
           <w:szCs w:val="22"/>
         </w:rPr>
-        <w:t xml:space="preserve">«Расскажите, как у вас сейчас организован процесс подписания документов? Какие типы контрагентов вам важно закрыть в первую очередь?»</w:t>
+        <w:t xml:space="preserve">Сначала уточняем контекст клиента, затем даём решение и фиксируем следующий шаг.</w:t>
       </w:r>
     </w:p>
     <w:p>
@@ -5851,11 +5393,11 @@
                 <w:bCs/>
                 <w:i w:val="false"/>
                 <w:iCs w:val="false"/>
-                <w:color w:val="CC3333"/>
-                <w:sz w:val="22"/>
-                <w:szCs w:val="22"/>
-              </w:rPr>
-              <w:t xml:space="preserve">🔴 Горячий</w:t>
+                <w:color w:val="E87722"/>
+                <w:sz w:val="22"/>
+                <w:szCs w:val="22"/>
+              </w:rPr>
+              <w:t xml:space="preserve">🟡 Тёплый</w:t>
             </w:r>
           </w:p>
         </w:tc>
@@ -5891,7 +5433,7 @@
                 <w:sz w:val="22"/>
                 <w:szCs w:val="22"/>
               </w:rPr>
-              <w:t xml:space="preserve">Алексей Морозов</w:t>
+              <w:t xml:space="preserve">Анна Сидорова</w:t>
             </w:r>
           </w:p>
         </w:tc>
@@ -5927,7 +5469,7 @@
                 <w:sz w:val="20"/>
                 <w:szCs w:val="20"/>
               </w:rPr>
-              <w:t xml:space="preserve">Договор до 2026-04-06</w:t>
+              <w:t xml:space="preserve">→ 2026-04-07</w:t>
             </w:r>
           </w:p>
         </w:tc>
@@ -5963,7 +5505,7 @@
                 <w:sz w:val="22"/>
                 <w:szCs w:val="22"/>
               </w:rPr>
-              <w:t xml:space="preserve">«Алексей, Эльмира. Отправила договор — хотела уточнить, получили? Готовы подтвердить?»</w:t>
+              <w:t xml:space="preserve">«Анна, Эльмира из Договор-24. Договорились созвониться — удобно сейчас пару минут?»</w:t>
             </w:r>
           </w:p>
         </w:tc>
@@ -5998,11 +5540,11 @@
                 <w:bCs/>
                 <w:i w:val="false"/>
                 <w:iCs w:val="false"/>
-                <w:color w:val="CC3333"/>
-                <w:sz w:val="22"/>
-                <w:szCs w:val="22"/>
-              </w:rPr>
-              <w:t xml:space="preserve">🔴 Горячий</w:t>
+                <w:color w:val="E87722"/>
+                <w:sz w:val="22"/>
+                <w:szCs w:val="22"/>
+              </w:rPr>
+              <w:t xml:space="preserve">🟡 Тёплый</w:t>
             </w:r>
           </w:p>
         </w:tc>
@@ -6039,7 +5581,7 @@
                 <w:sz w:val="22"/>
                 <w:szCs w:val="22"/>
               </w:rPr>
-              <w:t xml:space="preserve">+77019876543</w:t>
+              <w:t xml:space="preserve">Мария Петрова</w:t>
             </w:r>
           </w:p>
         </w:tc>
@@ -6076,7 +5618,7 @@
                 <w:sz w:val="20"/>
                 <w:szCs w:val="20"/>
               </w:rPr>
-              <w:t xml:space="preserve">Демо-доступ до 2026-04-07</w:t>
+              <w:t xml:space="preserve">→ 2026-04-10</w:t>
             </w:r>
           </w:p>
         </w:tc>
@@ -6113,7 +5655,7 @@
                 <w:sz w:val="22"/>
                 <w:szCs w:val="22"/>
               </w:rPr>
-              <w:t xml:space="preserve">«Здравствуйте, Эльмира из Договор-24. Вчера договорились на демо — отправила ссылку, всё получили?»</w:t>
+              <w:t xml:space="preserve">«Мария, Эльмира. Вы просили перезвонить в пятницу — звоню как договорились.»</w:t>
             </w:r>
           </w:p>
         </w:tc>
@@ -6187,7 +5729,7 @@
                 <w:sz w:val="22"/>
                 <w:szCs w:val="22"/>
               </w:rPr>
-              <w:t xml:space="preserve">Лариса Новикова</w:t>
+              <w:t xml:space="preserve">Алексей Морозов</w:t>
             </w:r>
           </w:p>
         </w:tc>
@@ -6223,7 +5765,7 @@
                 <w:sz w:val="20"/>
                 <w:szCs w:val="20"/>
               </w:rPr>
-              <w:t xml:space="preserve">Пробный доступ до 2026-04-07</w:t>
+              <w:t xml:space="preserve">до 2026-04-06</w:t>
             </w:r>
           </w:p>
         </w:tc>
@@ -6259,7 +5801,7 @@
                 <w:sz w:val="22"/>
                 <w:szCs w:val="22"/>
               </w:rPr>
-              <w:t xml:space="preserve">«Лариса, Эльмира. Активировала пробный доступ — отправила инструкцию. Удобно сейчас пройтись по первым шагам?»</w:t>
+              <w:t xml:space="preserve">«Алексей, Эльмира. Отправила договор — хотела уточнить, получили? Готовы подтвердить?»</w:t>
             </w:r>
           </w:p>
         </w:tc>
@@ -6294,11 +5836,11 @@
                 <w:bCs/>
                 <w:i w:val="false"/>
                 <w:iCs w:val="false"/>
-                <w:color w:val="E87722"/>
-                <w:sz w:val="22"/>
-                <w:szCs w:val="22"/>
-              </w:rPr>
-              <w:t xml:space="preserve">🟡 Тёплый</w:t>
+                <w:color w:val="CC3333"/>
+                <w:sz w:val="22"/>
+                <w:szCs w:val="22"/>
+              </w:rPr>
+              <w:t xml:space="preserve">🔴 Горячий</w:t>
             </w:r>
           </w:p>
         </w:tc>
@@ -6335,7 +5877,7 @@
                 <w:sz w:val="22"/>
                 <w:szCs w:val="22"/>
               </w:rPr>
-              <w:t xml:space="preserve">Анна Сидорова</w:t>
+              <w:t xml:space="preserve">+77019876543</w:t>
             </w:r>
           </w:p>
         </w:tc>
@@ -6372,7 +5914,7 @@
                 <w:sz w:val="20"/>
                 <w:szCs w:val="20"/>
               </w:rPr>
-              <w:t xml:space="preserve">Перезвон до 2026-04-07</w:t>
+              <w:t xml:space="preserve">до 2026-04-07</w:t>
             </w:r>
           </w:p>
         </w:tc>
@@ -6409,7 +5951,7 @@
                 <w:sz w:val="22"/>
                 <w:szCs w:val="22"/>
               </w:rPr>
-              <w:t xml:space="preserve">«Анна, Эльмира из Договор-24. Договорились созвониться — удобно сейчас пару минут?»</w:t>
+              <w:t xml:space="preserve">«Здравствуйте, Эльмира из Договор-24. Вчера договорились на демо — отправила ссылку, всё получили?»</w:t>
             </w:r>
           </w:p>
         </w:tc>
@@ -6443,11 +5985,11 @@
                 <w:bCs/>
                 <w:i w:val="false"/>
                 <w:iCs w:val="false"/>
-                <w:color w:val="E87722"/>
-                <w:sz w:val="22"/>
-                <w:szCs w:val="22"/>
-              </w:rPr>
-              <w:t xml:space="preserve">🟡 Тёплый</w:t>
+                <w:color w:val="CC3333"/>
+                <w:sz w:val="22"/>
+                <w:szCs w:val="22"/>
+              </w:rPr>
+              <w:t xml:space="preserve">🔴 Горячий</w:t>
             </w:r>
           </w:p>
         </w:tc>
@@ -6483,7 +6025,7 @@
                 <w:sz w:val="22"/>
                 <w:szCs w:val="22"/>
               </w:rPr>
-              <w:t xml:space="preserve">Мария Петрова</w:t>
+              <w:t xml:space="preserve">Лариса Новикова</w:t>
             </w:r>
           </w:p>
         </w:tc>
@@ -6519,7 +6061,7 @@
                 <w:sz w:val="20"/>
                 <w:szCs w:val="20"/>
               </w:rPr>
-              <w:t xml:space="preserve">Перезвон до 2026-04-10</w:t>
+              <w:t xml:space="preserve">до 2026-04-07</w:t>
             </w:r>
           </w:p>
         </w:tc>
@@ -6555,7 +6097,7 @@
                 <w:sz w:val="22"/>
                 <w:szCs w:val="22"/>
               </w:rPr>
-              <w:t xml:space="preserve">«Мария, Эльмира. Вы просили перезвонить в пятницу — звоню как договорились.»</w:t>
+              <w:t xml:space="preserve">«Лариса, Эльмира. Активировала пробный доступ — отправила инструкцию. Удобно сейчас пройтись по первым шагам?»</w:t>
             </w:r>
           </w:p>
         </w:tc>
@@ -6968,7 +6510,7 @@
                 <w:sz w:val="20"/>
                 <w:szCs w:val="20"/>
               </w:rPr>
-              <w:t xml:space="preserve">Тёплый/Продажа</w:t>
+              <w:t xml:space="preserve">Продажи · Тёплый/заявка</w:t>
             </w:r>
           </w:p>
         </w:tc>
@@ -7004,7 +6546,7 @@
                 <w:sz w:val="20"/>
                 <w:szCs w:val="20"/>
               </w:rPr>
-              <w:t xml:space="preserve">до 06.04</w:t>
+              <w:t xml:space="preserve">до 2026-04-06</w:t>
             </w:r>
           </w:p>
         </w:tc>
@@ -7190,7 +6732,7 @@
                 <w:sz w:val="20"/>
                 <w:szCs w:val="20"/>
               </w:rPr>
-              <w:t xml:space="preserve">Холодный</w:t>
+              <w:t xml:space="preserve">Продажи · Холодный</w:t>
             </w:r>
           </w:p>
         </w:tc>
@@ -7227,7 +6769,7 @@
                 <w:sz w:val="20"/>
                 <w:szCs w:val="20"/>
               </w:rPr>
-              <w:t xml:space="preserve">→ 07.04</w:t>
+              <w:t xml:space="preserve">→ 2026-04-07</w:t>
             </w:r>
           </w:p>
         </w:tc>
@@ -7410,7 +6952,7 @@
                 <w:sz w:val="20"/>
                 <w:szCs w:val="20"/>
               </w:rPr>
-              <w:t xml:space="preserve">Горячий/Входящий</w:t>
+              <w:t xml:space="preserve">Продажи · Горячий</w:t>
             </w:r>
           </w:p>
         </w:tc>
@@ -7446,7 +6988,7 @@
                 <w:sz w:val="20"/>
                 <w:szCs w:val="20"/>
               </w:rPr>
-              <w:t xml:space="preserve">до 07.04</w:t>
+              <w:t xml:space="preserve">до 2026-04-07</w:t>
             </w:r>
           </w:p>
         </w:tc>
@@ -7632,7 +7174,7 @@
                 <w:sz w:val="20"/>
                 <w:szCs w:val="20"/>
               </w:rPr>
-              <w:t xml:space="preserve">Тёплый/Продажа</w:t>
+              <w:t xml:space="preserve">Продажи · Тёплый/заявка</w:t>
             </w:r>
           </w:p>
         </w:tc>
@@ -7669,7 +7211,7 @@
                 <w:sz w:val="20"/>
                 <w:szCs w:val="20"/>
               </w:rPr>
-              <w:t xml:space="preserve">до 08.04</w:t>
+              <w:t xml:space="preserve">до 2026-04-08</w:t>
             </w:r>
           </w:p>
         </w:tc>
@@ -7852,7 +7394,7 @@
                 <w:sz w:val="20"/>
                 <w:szCs w:val="20"/>
               </w:rPr>
-              <w:t xml:space="preserve">Холодный</w:t>
+              <w:t xml:space="preserve">Продажи · Холодный</w:t>
             </w:r>
           </w:p>
         </w:tc>
@@ -7888,7 +7430,7 @@
                 <w:sz w:val="20"/>
                 <w:szCs w:val="20"/>
               </w:rPr>
-              <w:t xml:space="preserve">→ 10.04</w:t>
+              <w:t xml:space="preserve">→ 2026-04-10</w:t>
             </w:r>
           </w:p>
         </w:tc>
@@ -8074,7 +7616,7 @@
                 <w:sz w:val="20"/>
                 <w:szCs w:val="20"/>
               </w:rPr>
-              <w:t xml:space="preserve">Горячий/Входящий</w:t>
+              <w:t xml:space="preserve">Продажи · Горячий</w:t>
             </w:r>
           </w:p>
         </w:tc>
@@ -8111,7 +7653,7 @@
                 <w:sz w:val="20"/>
                 <w:szCs w:val="20"/>
               </w:rPr>
-              <w:t xml:space="preserve">Конкурент</w:t>
+              <w:t xml:space="preserve">Отказ — работает с конкурент…</w:t>
             </w:r>
           </w:p>
         </w:tc>
@@ -8294,7 +7836,7 @@
                 <w:sz w:val="20"/>
                 <w:szCs w:val="20"/>
               </w:rPr>
-              <w:t xml:space="preserve">Тёплый/Продажа</w:t>
+              <w:t xml:space="preserve">Продажи · Тёплый/заявка</w:t>
             </w:r>
           </w:p>
         </w:tc>
@@ -8330,7 +7872,7 @@
                 <w:sz w:val="20"/>
                 <w:szCs w:val="20"/>
               </w:rPr>
-              <w:t xml:space="preserve">Ждёт решения</w:t>
+              <w:t xml:space="preserve">Ждёт одобрения руководства</w:t>
             </w:r>
           </w:p>
         </w:tc>
@@ -8516,7 +8058,7 @@
                 <w:sz w:val="20"/>
                 <w:szCs w:val="20"/>
               </w:rPr>
-              <w:t xml:space="preserve">Горячий/Входящий</w:t>
+              <w:t xml:space="preserve">Продажи · Горячий</w:t>
             </w:r>
           </w:p>
         </w:tc>
@@ -8553,7 +8095,7 @@
                 <w:sz w:val="20"/>
                 <w:szCs w:val="20"/>
               </w:rPr>
-              <w:t xml:space="preserve">до 07.04</w:t>
+              <w:t xml:space="preserve">до 2026-04-07</w:t>
             </w:r>
           </w:p>
         </w:tc>
@@ -8711,7 +8253,7 @@
                 <w:sz w:val="22"/>
                 <w:szCs w:val="22"/>
               </w:rPr>
-              <w:t xml:space="preserve">Вчерашний итог: 8 звонков → 4 Договорились, 1 Открытых</w:t>
+              <w:t xml:space="preserve">Вчерашний итог: 8 звонков → 4 договорённостей, 1 открытых</w:t>
             </w:r>
           </w:p>
           <w:p>
@@ -8727,7 +8269,7 @@
                 <w:sz w:val="22"/>
                 <w:szCs w:val="22"/>
               </w:rPr>
-              <w:t xml:space="preserve">~180 000 тенге ждут обратного звонка 📞</w:t>
+              <w:t xml:space="preserve">Потенциал: ~180 000 тенге годовых подписок (1 × 180к) — не подобраны. 📞</w:t>
             </w:r>
           </w:p>
           <w:p>
@@ -8756,7 +8298,7 @@
                 <w:sz w:val="20"/>
                 <w:szCs w:val="20"/>
               </w:rPr>
-              <w:t xml:space="preserve">1. Алексей Морозов (+7 701 999-6001) — «Алексей, Эльмира. Отправила договор — хотела уточнить, получили? Готовы подтвердить?»</w:t>
+              <w:t xml:space="preserve">1. Анна Сидорова — «Анна, Эльмира из Договор-24. Договорились созвониться — удобно сейчас пару минут?»</w:t>
             </w:r>
           </w:p>
           <w:p>
@@ -8770,7 +8312,7 @@
                 <w:sz w:val="20"/>
                 <w:szCs w:val="20"/>
               </w:rPr>
-              <w:t xml:space="preserve">2. +77019876543 (+7 701 987-6543) — «Здравствуйте, Эльмира из Договор-24. Вчера договорились на демо — отправила ссылку, всё получили?»</w:t>
+              <w:t xml:space="preserve">2. Мария Петрова — «Мария, Эльмира. Вы просили перезвонить в пятницу — звоню как договорились.»</w:t>
             </w:r>
           </w:p>
           <w:p>
@@ -8784,7 +8326,7 @@
                 <w:sz w:val="20"/>
                 <w:szCs w:val="20"/>
               </w:rPr>
-              <w:t xml:space="preserve">3. Лариса Новикова (+7 701 999-6008) — «Лариса, Эльмира. Активировала пробный доступ — отправила инструкцию. Удобно сейчас пройтись по первым шагам?»</w:t>
+              <w:t xml:space="preserve">3. Алексей Морозов — «Алексей, Эльмира. Отправила договор — хотела уточнить, получили? Готовы подтвердить?»</w:t>
             </w:r>
           </w:p>
           <w:p>
@@ -8811,7 +8353,7 @@
                 <w:sz w:val="20"/>
                 <w:szCs w:val="20"/>
               </w:rPr>
-              <w:t xml:space="preserve">🏆 Челлендж: Задай 2+ уточняющих вопроса о потребностях ДО презентации (цель: 6 из 8 звонков · вчера 1/8 · рекорд: нет базы)</w:t>
+              <w:t xml:space="preserve">🏆 Челлендж: Сквозной фокус периода: Не выявляет детальные потребности — переходит в презентацию до понимания задачи клиента повторяется чаще всего и должен стать темой ближайших разборов.</w:t>
             </w:r>
           </w:p>
         </w:tc>

</xml_diff>